<commit_message>
docs: synchronize current test results and delivery exports
</commit_message>
<xml_diff>
--- a/06_defense/export/技术总结报告.docx
+++ b/06_defense/export/技术总结报告.docx
@@ -181,7 +181,7 @@
                 <w:rFonts w:ascii="Microsoft YaHei" w:hAnsi="Microsoft YaHei" w:eastAsia="Microsoft YaHei"/>
                 <w:sz w:val="18"/>
               </w:rPr>
-              <w:t>2026-09-02</w:t>
+              <w:t>2026-09-03</w:t>
             </w:r>
           </w:p>
         </w:tc>
@@ -398,7 +398,7 @@
           <w:b w:val="0"/>
           <w:sz w:val="22"/>
         </w:rPr>
-        <w:t>最终验收用例为 UC01–UC12，重点汇报 UC01、UC02、UC04。2026-09-02 分项结果：</w:t>
+        <w:t>最终验收用例为 UC01–UC12，重点汇报 UC01、UC02、UC04。2026-09-03 分项结果：</w:t>
       </w:r>
     </w:p>
     <w:p>
@@ -408,7 +408,7 @@
           <w:b w:val="0"/>
           <w:sz w:val="22"/>
         </w:rPr>
-        <w:t>- 后端单元/安全/控制器：80 通过，1 个 API 父入口按设计跳过</w:t>
+        <w:t>- 后端单元/安全/控制器：120/120 通过，1 个 API 父入口按设计跳过</w:t>
       </w:r>
     </w:p>
     <w:p>
@@ -438,7 +438,7 @@
           <w:b w:val="0"/>
           <w:sz w:val="22"/>
         </w:rPr>
-        <w:t>- Playwright E2E：6/6（Compose 与 Kind）</w:t>
+        <w:t>- Playwright E2E：单体与微服务入口均 42/42（12 个主流程、27 个备选/异常流程、3 个组合流程）</w:t>
       </w:r>
     </w:p>
     <w:p>
@@ -594,7 +594,7 @@
           <w:b w:val="0"/>
           <w:sz w:val="22"/>
         </w:rPr>
-        <w:t>原系统标签可复现；微服务版本三个业务库隔离、网关统一入口；容器、CI、K8s、HPA、故障和三次压测均有原始记录。文档可编辑源在 `02_docs/`，给老师的 Word 与带图 PDF 在仓库根目录 `提交包/`。站会简报、Project 截图、PPT、权重确认由组员按实际补充。</w:t>
+        <w:t>原系统标签可复现；微服务版本三个业务库隔离、网关统一入口；容器、CI、K8s、HPA、故障和三次压测均有原始记录。文档可编辑源在 `02_docs/`，给老师的 Word 与 PDF 在 `06_defense/export/`。站会简报、Project 截图、PPT、权重确认由组员按实际补充。</w:t>
       </w:r>
     </w:p>
     <w:sectPr>

</xml_diff>